<commit_message>
Cambios sin la API de las firmas
</commit_message>
<xml_diff>
--- a/docs/Guia_completa_de_uso_Expediente_Integro.docx
+++ b/docs/Guia_completa_de_uso_Expediente_Integro.docx
@@ -5619,7 +5619,7 @@
           <w:color w:val="162033"/>
           <w:sz w:val="22"/>
         </w:rPr>
-        <w:t>La web acepta PDF, JPG, JPEG, PNG o DOCX válidos. El tipo se detecta por contenido, no solo por extensión.</w:t>
+        <w:t>La web acepta PDF, JPG, JPEG o PNG válidos. El tipo se detecta por contenido, no solo por extensión.</w:t>
       </w:r>
     </w:p>
     <w:p>
@@ -5999,7 +5999,7 @@
         <w:keepLines/>
       </w:pPr>
       <w:r>
-        <w:t>DOCX se almacena, pero debe convertirse a PDF para una vista segura; el sistema no provoca una descarga accidental.</w:t>
+        <w:t>Los documentos DOCX no se admiten. Convierte el archivo a PDF antes de registrarlo en el sistema.</w:t>
       </w:r>
     </w:p>
     <w:p>
@@ -11641,7 +11641,7 @@
                 <w:color w:val="162033"/>
                 <w:sz w:val="16"/>
               </w:rPr>
-              <w:t>DOCX no se visualiza</w:t>
+              <w:t>DOCX rechazado</w:t>
             </w:r>
           </w:p>
         </w:tc>
@@ -11674,7 +11674,7 @@
                 <w:color w:val="162033"/>
                 <w:sz w:val="16"/>
               </w:rPr>
-              <w:t>El visor protegido no renderiza Word.</w:t>
+              <w:t>Word no forma parte de los formatos permitidos.</w:t>
             </w:r>
           </w:p>
         </w:tc>
@@ -11707,7 +11707,7 @@
                 <w:color w:val="162033"/>
                 <w:sz w:val="16"/>
               </w:rPr>
-              <w:t>Convierte una copia a PDF y crea una nueva versión; conserva el DOCX original si corresponde.</w:t>
+              <w:t>Convierte el documento a PDF antes de cargarlo.</w:t>
             </w:r>
           </w:p>
         </w:tc>
@@ -11885,7 +11885,7 @@
                 <w:color w:val="162033"/>
                 <w:sz w:val="16"/>
               </w:rPr>
-              <w:t>Contenido no es PDF/JPG/PNG/DOCX válido o supera el límite.</w:t>
+              <w:t>El contenido no es PDF/JPG/PNG válido o supera el límite.</w:t>
             </w:r>
           </w:p>
         </w:tc>
@@ -13015,7 +13015,7 @@
                 <w:color w:val="162033"/>
                 <w:sz w:val="17"/>
               </w:rPr>
-              <w:t>PDF/JPG/PNG/DOCX válido crea documento y versión en MinIO.</w:t>
+              <w:t>Un PDF/JPG/PNG válido crea el documento y su versión en MinIO.</w:t>
             </w:r>
           </w:p>
         </w:tc>

</xml_diff>

<commit_message>
Revert "Cambios sin la API de las firmas"
This reverts commit 87cf43fb86b3e8d15e26b515b5fca0825d6fe371.
</commit_message>
<xml_diff>
--- a/docs/Guia_completa_de_uso_Expediente_Integro.docx
+++ b/docs/Guia_completa_de_uso_Expediente_Integro.docx
@@ -5619,7 +5619,7 @@
           <w:color w:val="162033"/>
           <w:sz w:val="22"/>
         </w:rPr>
-        <w:t>La web acepta PDF, JPG, JPEG o PNG válidos. El tipo se detecta por contenido, no solo por extensión.</w:t>
+        <w:t>La web acepta PDF, JPG, JPEG, PNG o DOCX válidos. El tipo se detecta por contenido, no solo por extensión.</w:t>
       </w:r>
     </w:p>
     <w:p>
@@ -5999,7 +5999,7 @@
         <w:keepLines/>
       </w:pPr>
       <w:r>
-        <w:t>Los documentos DOCX no se admiten. Convierte el archivo a PDF antes de registrarlo en el sistema.</w:t>
+        <w:t>DOCX se almacena, pero debe convertirse a PDF para una vista segura; el sistema no provoca una descarga accidental.</w:t>
       </w:r>
     </w:p>
     <w:p>
@@ -11641,7 +11641,7 @@
                 <w:color w:val="162033"/>
                 <w:sz w:val="16"/>
               </w:rPr>
-              <w:t>DOCX rechazado</w:t>
+              <w:t>DOCX no se visualiza</w:t>
             </w:r>
           </w:p>
         </w:tc>
@@ -11674,7 +11674,7 @@
                 <w:color w:val="162033"/>
                 <w:sz w:val="16"/>
               </w:rPr>
-              <w:t>Word no forma parte de los formatos permitidos.</w:t>
+              <w:t>El visor protegido no renderiza Word.</w:t>
             </w:r>
           </w:p>
         </w:tc>
@@ -11707,7 +11707,7 @@
                 <w:color w:val="162033"/>
                 <w:sz w:val="16"/>
               </w:rPr>
-              <w:t>Convierte el documento a PDF antes de cargarlo.</w:t>
+              <w:t>Convierte una copia a PDF y crea una nueva versión; conserva el DOCX original si corresponde.</w:t>
             </w:r>
           </w:p>
         </w:tc>
@@ -11885,7 +11885,7 @@
                 <w:color w:val="162033"/>
                 <w:sz w:val="16"/>
               </w:rPr>
-              <w:t>El contenido no es PDF/JPG/PNG válido o supera el límite.</w:t>
+              <w:t>Contenido no es PDF/JPG/PNG/DOCX válido o supera el límite.</w:t>
             </w:r>
           </w:p>
         </w:tc>
@@ -13015,7 +13015,7 @@
                 <w:color w:val="162033"/>
                 <w:sz w:val="17"/>
               </w:rPr>
-              <w:t>Un PDF/JPG/PNG válido crea el documento y su versión en MinIO.</w:t>
+              <w:t>PDF/JPG/PNG/DOCX válido crea documento y versión en MinIO.</w:t>
             </w:r>
           </w:p>
         </w:tc>

</xml_diff>